<commit_message>
Deploying to gh-pages from @ Morrison-Lab/psc@4050d220e0e926af915a70fea2e0fd57bdec52a5 🚀
</commit_message>
<xml_diff>
--- a/chapters/quarto.docx
+++ b/chapters/quarto.docx
@@ -15,7 +15,7 @@
         <w:pStyle w:val="Date"/>
       </w:pPr>
       <w:r>
-        <w:t xml:space="preserve">Last modified: 2026-10-14 12:39:25 (PDT)</w:t>
+        <w:t xml:space="preserve">Last modified: 2026-10-15 15:15:23 (PDT)</w:t>
       </w:r>
     </w:p>
     <w:p>
@@ -526,55 +526,40 @@
         <w:pStyle w:val="FirstParagraph"/>
       </w:pPr>
       <w:r>
-        <w:t xml:space="preserve">If you’re an R Markdown user,</w:t>
-      </w:r>
-      <w:r>
-        <w:t xml:space="preserve"> </w:t>
-      </w:r>
-      <w:r>
-        <w:t xml:space="preserve">you might be thinking</w:t>
-      </w:r>
-      <w:r>
-        <w:t xml:space="preserve"> </w:t>
-      </w:r>
-      <w:r>
-        <w:t xml:space="preserve">“Quarto sounds a lot like R Markdown.”</w:t>
-      </w:r>
-      <w:r>
-        <w:t xml:space="preserve"> </w:t>
-      </w:r>
-      <w:r>
-        <w:t xml:space="preserve">You’re not wrong!</w:t>
-      </w:r>
-      <w:r>
-        <w:t xml:space="preserve"> </w:t>
-      </w:r>
-      <w:r>
-        <w:t xml:space="preserve">Quarto unifies the functionality of many packages from the R Markdown ecosystem</w:t>
-      </w:r>
-      <w:r>
-        <w:t xml:space="preserve"> </w:t>
-      </w:r>
-      <w:r>
-        <w:t xml:space="preserve">(rmarkdown, bookdown, distill, xaringan, etc.)</w:t>
-      </w:r>
-      <w:r>
-        <w:t xml:space="preserve"> </w:t>
-      </w:r>
-      <w:r>
-        <w:t xml:space="preserve">into a single consistent system as well as extends it with native support for multiple programming languages like Python and Julia in addition to R.</w:t>
-      </w:r>
-      <w:r>
-        <w:t xml:space="preserve"> </w:t>
-      </w:r>
-      <w:r>
-        <w:t xml:space="preserve">In a way,</w:t>
-      </w:r>
-      <w:r>
-        <w:t xml:space="preserve"> </w:t>
-      </w:r>
-      <w:r>
-        <w:t xml:space="preserve">Quarto reflects everything that was learned from expanding and supporting the R Markdown ecosystem over a decade.</w:t>
+        <w:t xml:space="preserve">Quarto is the successor to R Markdown,</w:t>
+      </w:r>
+      <w:r>
+        <w:t xml:space="preserve"> </w:t>
+      </w:r>
+      <w:r>
+        <w:t xml:space="preserve">the tool many R users know for combining prose and code.</w:t>
+      </w:r>
+      <w:r>
+        <w:t xml:space="preserve"> </w:t>
+      </w:r>
+      <w:r>
+        <w:t xml:space="preserve">Besides R, Quarto runs Python and Julia code,</w:t>
+      </w:r>
+      <w:r>
+        <w:t xml:space="preserve"> </w:t>
+      </w:r>
+      <w:r>
+        <w:t xml:space="preserve">and it replaces the separate add-on packages</w:t>
+      </w:r>
+      <w:r>
+        <w:t xml:space="preserve"> </w:t>
+      </w:r>
+      <w:r>
+        <w:t xml:space="preserve">that R Markdown needed for books, websites, and slides</w:t>
+      </w:r>
+      <w:r>
+        <w:t xml:space="preserve"> </w:t>
+      </w:r>
+      <w:r>
+        <w:t xml:space="preserve">(Wickham et al. 2023, ch. 28)</w:t>
+      </w:r>
+      <w:r>
+        <w:t xml:space="preserve">.</w:t>
       </w:r>
     </w:p>
     <w:bookmarkEnd w:id="12"/>

</xml_diff>

<commit_message>
Deploying to gh-pages from @ Morrison-Lab/psc@e891af5bf243fbf522dd62cfbd6bec705c044466 🚀
</commit_message>
<xml_diff>
--- a/chapters/quarto.docx
+++ b/chapters/quarto.docx
@@ -15,7 +15,7 @@
         <w:pStyle w:val="Date"/>
       </w:pPr>
       <w:r>
-        <w:t xml:space="preserve">Last modified: 2026-10-15 15:15:23 (PDT)</w:t>
+        <w:t xml:space="preserve">Last modified: 2026-10-15 15:35:31 (PDT)</w:t>
       </w:r>
     </w:p>
     <w:p>
@@ -526,25 +526,19 @@
         <w:pStyle w:val="FirstParagraph"/>
       </w:pPr>
       <w:r>
-        <w:t xml:space="preserve">Quarto is the successor to R Markdown,</w:t>
-      </w:r>
-      <w:r>
-        <w:t xml:space="preserve"> </w:t>
-      </w:r>
-      <w:r>
-        <w:t xml:space="preserve">the tool many R users know for combining prose and code.</w:t>
-      </w:r>
-      <w:r>
-        <w:t xml:space="preserve"> </w:t>
-      </w:r>
-      <w:r>
-        <w:t xml:space="preserve">Besides R, Quarto runs Python and Julia code,</w:t>
-      </w:r>
-      <w:r>
-        <w:t xml:space="preserve"> </w:t>
-      </w:r>
-      <w:r>
-        <w:t xml:space="preserve">and it replaces the separate add-on packages</w:t>
+        <w:t xml:space="preserve">Quarto is the successor to R Markdown.</w:t>
+      </w:r>
+      <w:r>
+        <w:t xml:space="preserve"> </w:t>
+      </w:r>
+      <w:r>
+        <w:t xml:space="preserve">Quarto runs Python and Julia as well as R,</w:t>
+      </w:r>
+      <w:r>
+        <w:t xml:space="preserve"> </w:t>
+      </w:r>
+      <w:r>
+        <w:t xml:space="preserve">and it replaces the add-on packages</w:t>
       </w:r>
       <w:r>
         <w:t xml:space="preserve"> </w:t>

</xml_diff>